<commit_message>
Añadir todos los archivos del proyecto al repositorio
</commit_message>
<xml_diff>
--- a/Silabo reestructurado.docx
+++ b/Silabo reestructurado.docx
@@ -15,8 +15,6 @@
           <w:lang w:eastAsia="es-ES_tradnl"/>
         </w:rPr>
       </w:pPr>
-      <w:bookmarkStart w:id="0" w:name="_GoBack"/>
-      <w:bookmarkEnd w:id="0"/>
       <w:r>
         <w:rPr>
           <w:rFonts w:ascii="Times New Roman" w:eastAsia="Times New Roman" w:hAnsi="Times New Roman" w:cs="Times New Roman"/>
@@ -26,12 +24,13 @@
           <w:szCs w:val="36"/>
           <w:lang w:eastAsia="es-ES_tradnl"/>
         </w:rPr>
-        <w:t>Sílabo: Cálculo Diferencial para Ciencia de Datos (UTMACH)</w:t>
-      </w:r>
-    </w:p>
-    <w:p>
-      <w:pPr>
-        <w:spacing w:before="100" w:beforeAutospacing="1" w:after="100" w:afterAutospacing="1"/>
+        <w:t xml:space="preserve">Sílabo: Cálculo Diferencial para Ciencia de Datos </w:t>
+      </w:r>
+    </w:p>
+    <w:p>
+      <w:pPr>
+        <w:spacing w:before="100" w:beforeAutospacing="1" w:after="100" w:afterAutospacing="1"/>
+        <w:jc w:val="both"/>
         <w:rPr>
           <w:rFonts w:ascii="Times New Roman" w:eastAsia="Times New Roman" w:hAnsi="Times New Roman" w:cs="Times New Roman"/>
           <w:lang w:eastAsia="es-ES_tradnl"/>
@@ -52,16 +51,6 @@
           <w:lang w:eastAsia="es-ES_tradnl"/>
         </w:rPr>
       </w:pPr>
-      <w:r>
-        <w:rPr>
-          <w:rFonts w:ascii="Times New Roman" w:eastAsia="Times New Roman" w:hAnsi="Times New Roman" w:cs="Times New Roman"/>
-          <w:noProof/>
-          <w:lang w:eastAsia="es-ES_tradnl"/>
-        </w:rPr>
-        <w:pict>
-          <v:rect id="_x0000_i1028" alt="" style="width:441.9pt;height:.05pt;mso-width-percent:0;mso-height-percent:0;mso-width-percent:0;mso-height-percent:0" o:hralign="center" o:hrstd="t" o:hr="t" fillcolor="#a0a0a0" stroked="f"/>
-        </w:pict>
-      </w:r>
     </w:p>
     <w:p>
       <w:pPr>
@@ -117,6 +106,44 @@
     </w:p>
     <w:p>
       <w:pPr>
+        <w:spacing w:before="100" w:beforeAutospacing="1" w:after="100" w:afterAutospacing="1"/>
+        <w:rPr>
+          <w:rFonts w:ascii="Times New Roman" w:eastAsia="Times New Roman" w:hAnsi="Times New Roman" w:cs="Times New Roman"/>
+          <w:b/>
+          <w:bCs/>
+          <w:lang w:eastAsia="es-ES_tradnl"/>
+        </w:rPr>
+      </w:pPr>
+      <w:r>
+        <w:rPr>
+          <w:rFonts w:ascii="Times New Roman" w:eastAsia="Times New Roman" w:hAnsi="Times New Roman" w:cs="Times New Roman"/>
+          <w:b/>
+          <w:bCs/>
+          <w:lang w:eastAsia="es-ES_tradnl"/>
+        </w:rPr>
+        <w:t xml:space="preserve">Unidad 1: </w:t>
+      </w:r>
+      <w:r>
+        <w:rPr>
+          <w:rFonts w:ascii="Times New Roman" w:eastAsia="Times New Roman" w:hAnsi="Times New Roman" w:cs="Times New Roman"/>
+          <w:b/>
+          <w:bCs/>
+          <w:lang w:eastAsia="es-ES_tradnl"/>
+        </w:rPr>
+        <w:t>Revisión</w:t>
+      </w:r>
+      <w:r>
+        <w:rPr>
+          <w:rFonts w:ascii="Times New Roman" w:eastAsia="Times New Roman" w:hAnsi="Times New Roman" w:cs="Times New Roman"/>
+          <w:b/>
+          <w:bCs/>
+          <w:lang w:eastAsia="es-ES_tradnl"/>
+        </w:rPr>
+        <w:t xml:space="preserve"> de prerequisistos</w:t>
+      </w:r>
+    </w:p>
+    <w:p>
+      <w:pPr>
         <w:numPr>
           <w:ilvl w:val="0"/>
           <w:numId w:val="5"/>
@@ -130,11 +157,19 @@
       <w:r>
         <w:rPr>
           <w:rFonts w:ascii="Times New Roman" w:eastAsia="Times New Roman" w:hAnsi="Times New Roman" w:cs="Times New Roman"/>
-          <w:b/>
-          <w:bCs/>
-          <w:lang w:eastAsia="es-ES_tradnl"/>
-        </w:rPr>
-        <w:t>Semana 1: Revisión de Álgebra y Funciones</w:t>
+          <w:bCs/>
+          <w:lang w:eastAsia="es-ES_tradnl"/>
+        </w:rPr>
+        <w:t>Semana</w:t>
+      </w:r>
+      <w:r>
+        <w:rPr>
+          <w:rFonts w:ascii="Times New Roman" w:eastAsia="Times New Roman" w:hAnsi="Times New Roman" w:cs="Times New Roman"/>
+          <w:b/>
+          <w:bCs/>
+          <w:lang w:eastAsia="es-ES_tradnl"/>
+        </w:rPr>
+        <w:t xml:space="preserve"> 1: Revisión de Álgebra y Funciones</w:t>
       </w:r>
     </w:p>
     <w:p>
@@ -695,7 +730,16 @@
           <w:rFonts w:ascii="Times New Roman" w:eastAsia="Times New Roman" w:hAnsi="Times New Roman" w:cs="Times New Roman"/>
           <w:lang w:eastAsia="es-ES_tradnl"/>
         </w:rPr>
-        <w:t>Revisión detallada de material complementario sobre álgebra básica, números reales, intervalos y valor absoluto (incluyendo los materiales de "Números Reales" ya existentes).</w:t>
+        <w:t>Revisión detallada de material complementario sobre álgebra básica, números reales, intervalos y valor absoluto (incluyendo los mat</w:t>
+      </w:r>
+      <w:bookmarkStart w:id="0" w:name="_GoBack"/>
+      <w:bookmarkEnd w:id="0"/>
+      <w:r>
+        <w:rPr>
+          <w:rFonts w:ascii="Times New Roman" w:eastAsia="Times New Roman" w:hAnsi="Times New Roman" w:cs="Times New Roman"/>
+          <w:lang w:eastAsia="es-ES_tradnl"/>
+        </w:rPr>
+        <w:t>eriales de "Números Reales" ya existentes).</w:t>
       </w:r>
     </w:p>
     <w:p>
@@ -737,6 +781,19 @@
         </w:rPr>
         <w:t>Exploración independiente de diferentes tipos de funciones y sus gráficas en Desmos o Python.</w:t>
       </w:r>
+    </w:p>
+    <w:p>
+      <w:pPr>
+        <w:numPr>
+          <w:ilvl w:val="2"/>
+          <w:numId w:val="5"/>
+        </w:numPr>
+        <w:spacing w:before="100" w:beforeAutospacing="1" w:after="100" w:afterAutospacing="1"/>
+        <w:rPr>
+          <w:rFonts w:ascii="Times New Roman" w:eastAsia="Times New Roman" w:hAnsi="Times New Roman" w:cs="Times New Roman"/>
+          <w:lang w:eastAsia="es-ES_tradnl"/>
+        </w:rPr>
+      </w:pPr>
     </w:p>
     <w:p>
       <w:pPr>
@@ -913,6 +970,308 @@
           <w:rFonts w:ascii="Times New Roman" w:eastAsia="Times New Roman" w:hAnsi="Times New Roman" w:cs="Times New Roman"/>
           <w:lang w:eastAsia="es-ES_tradnl"/>
         </w:rPr>
+        <w:t xml:space="preserve">Laboratorio: Explorar límites numéricamente usando </w:t>
+      </w:r>
+      <w:r>
+        <w:rPr>
+          <w:rFonts w:ascii="Times New Roman" w:eastAsia="Times New Roman" w:hAnsi="Times New Roman" w:cs="Times New Roman"/>
+          <w:b/>
+          <w:bCs/>
+          <w:lang w:eastAsia="es-ES_tradnl"/>
+        </w:rPr>
+        <w:t>tablas de valores</w:t>
+      </w:r>
+      <w:r>
+        <w:rPr>
+          <w:rFonts w:ascii="Times New Roman" w:eastAsia="Times New Roman" w:hAnsi="Times New Roman" w:cs="Times New Roman"/>
+          <w:lang w:eastAsia="es-ES_tradnl"/>
+        </w:rPr>
+        <w:t xml:space="preserve"> y gráficamente con Python para funciones con límites finitos, infinitos o que no existen.</w:t>
+      </w:r>
+    </w:p>
+    <w:p>
+      <w:pPr>
+        <w:numPr>
+          <w:ilvl w:val="1"/>
+          <w:numId w:val="5"/>
+        </w:numPr>
+        <w:spacing w:before="100" w:beforeAutospacing="1" w:after="100" w:afterAutospacing="1"/>
+        <w:rPr>
+          <w:rFonts w:ascii="Times New Roman" w:eastAsia="Times New Roman" w:hAnsi="Times New Roman" w:cs="Times New Roman"/>
+          <w:lang w:eastAsia="es-ES_tradnl"/>
+        </w:rPr>
+      </w:pPr>
+      <w:r>
+        <w:rPr>
+          <w:rFonts w:ascii="Times New Roman" w:eastAsia="Times New Roman" w:hAnsi="Times New Roman" w:cs="Times New Roman"/>
+          <w:b/>
+          <w:bCs/>
+          <w:lang w:eastAsia="es-ES_tradnl"/>
+        </w:rPr>
+        <w:t>Actividades de Aprendizaje Autónomo (Recomendado 2-3h):</w:t>
+      </w:r>
+    </w:p>
+    <w:p>
+      <w:pPr>
+        <w:numPr>
+          <w:ilvl w:val="2"/>
+          <w:numId w:val="5"/>
+        </w:numPr>
+        <w:spacing w:before="100" w:beforeAutospacing="1" w:after="100" w:afterAutospacing="1"/>
+        <w:rPr>
+          <w:rFonts w:ascii="Times New Roman" w:eastAsia="Times New Roman" w:hAnsi="Times New Roman" w:cs="Times New Roman"/>
+          <w:lang w:eastAsia="es-ES_tradnl"/>
+        </w:rPr>
+      </w:pPr>
+      <w:r>
+        <w:rPr>
+          <w:rFonts w:ascii="Times New Roman" w:eastAsia="Times New Roman" w:hAnsi="Times New Roman" w:cs="Times New Roman"/>
+          <w:lang w:eastAsia="es-ES_tradnl"/>
+        </w:rPr>
+        <w:t>Resolución de ejercicios de cálculo de límites básicos.</w:t>
+      </w:r>
+    </w:p>
+    <w:p>
+      <w:pPr>
+        <w:numPr>
+          <w:ilvl w:val="2"/>
+          <w:numId w:val="5"/>
+        </w:numPr>
+        <w:spacing w:before="100" w:beforeAutospacing="1" w:after="100" w:afterAutospacing="1"/>
+        <w:rPr>
+          <w:rFonts w:ascii="Times New Roman" w:eastAsia="Times New Roman" w:hAnsi="Times New Roman" w:cs="Times New Roman"/>
+          <w:lang w:eastAsia="es-ES_tradnl"/>
+        </w:rPr>
+      </w:pPr>
+      <w:r>
+        <w:rPr>
+          <w:rFonts w:ascii="Times New Roman" w:eastAsia="Times New Roman" w:hAnsi="Times New Roman" w:cs="Times New Roman"/>
+          <w:lang w:eastAsia="es-ES_tradnl"/>
+        </w:rPr>
+        <w:t>Investigación de funciones de costo o activación en ML que exhiban comportamiento asintótico o de saturación.</w:t>
+      </w:r>
+    </w:p>
+    <w:p>
+      <w:pPr>
+        <w:spacing w:before="100" w:beforeAutospacing="1" w:after="100" w:afterAutospacing="1"/>
+        <w:rPr>
+          <w:rFonts w:ascii="Times New Roman" w:eastAsia="Times New Roman" w:hAnsi="Times New Roman" w:cs="Times New Roman"/>
+          <w:lang w:eastAsia="es-ES_tradnl"/>
+        </w:rPr>
+      </w:pPr>
+    </w:p>
+    <w:p>
+      <w:pPr>
+        <w:spacing w:before="100" w:beforeAutospacing="1" w:after="100" w:afterAutospacing="1"/>
+        <w:rPr>
+          <w:rFonts w:ascii="Times New Roman" w:eastAsia="Times New Roman" w:hAnsi="Times New Roman" w:cs="Times New Roman"/>
+          <w:lang w:eastAsia="es-ES_tradnl"/>
+        </w:rPr>
+      </w:pPr>
+    </w:p>
+    <w:p>
+      <w:pPr>
+        <w:spacing w:before="100" w:beforeAutospacing="1" w:after="100" w:afterAutospacing="1"/>
+        <w:rPr>
+          <w:rFonts w:ascii="Times New Roman" w:eastAsia="Times New Roman" w:hAnsi="Times New Roman" w:cs="Times New Roman"/>
+          <w:lang w:eastAsia="es-ES_tradnl"/>
+        </w:rPr>
+      </w:pPr>
+    </w:p>
+    <w:p>
+      <w:pPr>
+        <w:spacing w:before="100" w:beforeAutospacing="1" w:after="100" w:afterAutospacing="1"/>
+        <w:rPr>
+          <w:rFonts w:ascii="Times New Roman" w:eastAsia="Times New Roman" w:hAnsi="Times New Roman" w:cs="Times New Roman"/>
+          <w:lang w:eastAsia="es-ES_tradnl"/>
+        </w:rPr>
+      </w:pPr>
+    </w:p>
+    <w:p>
+      <w:pPr>
+        <w:spacing w:before="100" w:beforeAutospacing="1" w:after="100" w:afterAutospacing="1"/>
+        <w:rPr>
+          <w:rFonts w:ascii="Times New Roman" w:eastAsia="Times New Roman" w:hAnsi="Times New Roman" w:cs="Times New Roman"/>
+          <w:lang w:eastAsia="es-ES_tradnl"/>
+        </w:rPr>
+      </w:pPr>
+    </w:p>
+    <w:p>
+      <w:pPr>
+        <w:numPr>
+          <w:ilvl w:val="0"/>
+          <w:numId w:val="5"/>
+        </w:numPr>
+        <w:spacing w:before="100" w:beforeAutospacing="1" w:after="100" w:afterAutospacing="1"/>
+        <w:rPr>
+          <w:rFonts w:ascii="Times New Roman" w:eastAsia="Times New Roman" w:hAnsi="Times New Roman" w:cs="Times New Roman"/>
+          <w:lang w:eastAsia="es-ES_tradnl"/>
+        </w:rPr>
+      </w:pPr>
+      <w:r>
+        <w:rPr>
+          <w:rFonts w:ascii="Times New Roman" w:eastAsia="Times New Roman" w:hAnsi="Times New Roman" w:cs="Times New Roman"/>
+          <w:b/>
+          <w:bCs/>
+          <w:lang w:eastAsia="es-ES_tradnl"/>
+        </w:rPr>
+        <w:t>Semana 2: Límites I: Definición e Interpretación</w:t>
+      </w:r>
+    </w:p>
+    <w:p>
+      <w:pPr>
+        <w:numPr>
+          <w:ilvl w:val="1"/>
+          <w:numId w:val="5"/>
+        </w:numPr>
+        <w:spacing w:before="100" w:beforeAutospacing="1" w:after="100" w:afterAutospacing="1"/>
+        <w:rPr>
+          <w:rFonts w:ascii="Times New Roman" w:eastAsia="Times New Roman" w:hAnsi="Times New Roman" w:cs="Times New Roman"/>
+          <w:lang w:eastAsia="es-ES_tradnl"/>
+        </w:rPr>
+      </w:pPr>
+      <w:r>
+        <w:rPr>
+          <w:rFonts w:ascii="Times New Roman" w:eastAsia="Times New Roman" w:hAnsi="Times New Roman" w:cs="Times New Roman"/>
+          <w:b/>
+          <w:bCs/>
+          <w:lang w:eastAsia="es-ES_tradnl"/>
+        </w:rPr>
+        <w:t>Actividades de Aprendizaje en Contacto con el Docente (2h):</w:t>
+      </w:r>
+    </w:p>
+    <w:p>
+      <w:pPr>
+        <w:numPr>
+          <w:ilvl w:val="2"/>
+          <w:numId w:val="5"/>
+        </w:numPr>
+        <w:spacing w:before="100" w:beforeAutospacing="1" w:after="100" w:afterAutospacing="1"/>
+        <w:rPr>
+          <w:rFonts w:ascii="Times New Roman" w:eastAsia="Times New Roman" w:hAnsi="Times New Roman" w:cs="Times New Roman"/>
+          <w:lang w:eastAsia="es-ES_tradnl"/>
+        </w:rPr>
+      </w:pPr>
+      <w:r>
+        <w:rPr>
+          <w:rFonts w:ascii="Times New Roman" w:eastAsia="Times New Roman" w:hAnsi="Times New Roman" w:cs="Times New Roman"/>
+          <w:lang w:eastAsia="es-ES_tradnl"/>
+        </w:rPr>
+        <w:t xml:space="preserve">Definición formal e intuitiva de </w:t>
+      </w:r>
+      <w:r>
+        <w:rPr>
+          <w:rFonts w:ascii="Times New Roman" w:eastAsia="Times New Roman" w:hAnsi="Times New Roman" w:cs="Times New Roman"/>
+          <w:b/>
+          <w:bCs/>
+          <w:lang w:eastAsia="es-ES_tradnl"/>
+        </w:rPr>
+        <w:t>límite</w:t>
+      </w:r>
+      <w:r>
+        <w:rPr>
+          <w:rFonts w:ascii="Times New Roman" w:eastAsia="Times New Roman" w:hAnsi="Times New Roman" w:cs="Times New Roman"/>
+          <w:lang w:eastAsia="es-ES_tradnl"/>
+        </w:rPr>
+        <w:t>.</w:t>
+      </w:r>
+    </w:p>
+    <w:p>
+      <w:pPr>
+        <w:numPr>
+          <w:ilvl w:val="2"/>
+          <w:numId w:val="5"/>
+        </w:numPr>
+        <w:spacing w:before="100" w:beforeAutospacing="1" w:after="100" w:afterAutospacing="1"/>
+        <w:rPr>
+          <w:rFonts w:ascii="Times New Roman" w:eastAsia="Times New Roman" w:hAnsi="Times New Roman" w:cs="Times New Roman"/>
+          <w:lang w:eastAsia="es-ES_tradnl"/>
+        </w:rPr>
+      </w:pPr>
+      <w:r>
+        <w:rPr>
+          <w:rFonts w:ascii="Times New Roman" w:eastAsia="Times New Roman" w:hAnsi="Times New Roman" w:cs="Times New Roman"/>
+          <w:lang w:eastAsia="es-ES_tradnl"/>
+        </w:rPr>
+        <w:t>Límites laterales y su relación con la existencia del límite.</w:t>
+      </w:r>
+    </w:p>
+    <w:p>
+      <w:pPr>
+        <w:numPr>
+          <w:ilvl w:val="2"/>
+          <w:numId w:val="5"/>
+        </w:numPr>
+        <w:spacing w:before="100" w:beforeAutospacing="1" w:after="100" w:afterAutospacing="1"/>
+        <w:rPr>
+          <w:rFonts w:ascii="Times New Roman" w:eastAsia="Times New Roman" w:hAnsi="Times New Roman" w:cs="Times New Roman"/>
+          <w:lang w:eastAsia="es-ES_tradnl"/>
+        </w:rPr>
+      </w:pPr>
+      <w:r>
+        <w:rPr>
+          <w:rFonts w:ascii="Times New Roman" w:eastAsia="Times New Roman" w:hAnsi="Times New Roman" w:cs="Times New Roman"/>
+          <w:lang w:eastAsia="es-ES_tradnl"/>
+        </w:rPr>
+        <w:t xml:space="preserve">Límites al infinito y límites infinitos: interpretación gráfica y aplicaciones en </w:t>
+      </w:r>
+      <w:r>
+        <w:rPr>
+          <w:rFonts w:ascii="Times New Roman" w:eastAsia="Times New Roman" w:hAnsi="Times New Roman" w:cs="Times New Roman"/>
+          <w:b/>
+          <w:bCs/>
+          <w:lang w:eastAsia="es-ES_tradnl"/>
+        </w:rPr>
+        <w:t>asíntotas</w:t>
+      </w:r>
+      <w:r>
+        <w:rPr>
+          <w:rFonts w:ascii="Times New Roman" w:eastAsia="Times New Roman" w:hAnsi="Times New Roman" w:cs="Times New Roman"/>
+          <w:lang w:eastAsia="es-ES_tradnl"/>
+        </w:rPr>
+        <w:t xml:space="preserve"> (relevancia para el comportamiento asintótico de modelos).</w:t>
+      </w:r>
+    </w:p>
+    <w:p>
+      <w:pPr>
+        <w:numPr>
+          <w:ilvl w:val="1"/>
+          <w:numId w:val="5"/>
+        </w:numPr>
+        <w:spacing w:before="100" w:beforeAutospacing="1" w:after="100" w:afterAutospacing="1"/>
+        <w:rPr>
+          <w:rFonts w:ascii="Times New Roman" w:eastAsia="Times New Roman" w:hAnsi="Times New Roman" w:cs="Times New Roman"/>
+          <w:lang w:eastAsia="es-ES_tradnl"/>
+        </w:rPr>
+      </w:pPr>
+      <w:r>
+        <w:rPr>
+          <w:rFonts w:ascii="Times New Roman" w:eastAsia="Times New Roman" w:hAnsi="Times New Roman" w:cs="Times New Roman"/>
+          <w:b/>
+          <w:bCs/>
+          <w:lang w:eastAsia="es-ES_tradnl"/>
+        </w:rPr>
+        <w:t>Actividades de Aprendizaje Práctico – Experimental (1h):</w:t>
+      </w:r>
+    </w:p>
+    <w:p>
+      <w:pPr>
+        <w:numPr>
+          <w:ilvl w:val="2"/>
+          <w:numId w:val="5"/>
+        </w:numPr>
+        <w:spacing w:before="100" w:beforeAutospacing="1" w:after="100" w:afterAutospacing="1"/>
+        <w:rPr>
+          <w:rFonts w:ascii="Times New Roman" w:eastAsia="Times New Roman" w:hAnsi="Times New Roman" w:cs="Times New Roman"/>
+          <w:lang w:eastAsia="es-ES_tradnl"/>
+        </w:rPr>
+      </w:pPr>
+      <w:r>
+        <w:rPr>
+          <w:rFonts w:ascii="Times New Roman" w:eastAsia="Times New Roman" w:hAnsi="Times New Roman" w:cs="Times New Roman"/>
+          <w:lang w:eastAsia="es-ES_tradnl"/>
+        </w:rPr>
+        <w:lastRenderedPageBreak/>
         <w:t xml:space="preserve">Laboratorio: Explorar límites numéricamente usando </w:t>
       </w:r>
       <w:r>
@@ -1294,7 +1653,6 @@
           <w:szCs w:val="27"/>
           <w:lang w:eastAsia="es-ES_tradnl"/>
         </w:rPr>
-        <w:lastRenderedPageBreak/>
         <w:t xml:space="preserve">Unidad 2: La Derivada: Midiendo la Tasa de Cambio y el Impacto </w:t>
       </w:r>
       <w:r>
@@ -1500,6 +1858,7 @@
           <w:rFonts w:ascii="Times New Roman" w:eastAsia="Times New Roman" w:hAnsi="Times New Roman" w:cs="Times New Roman"/>
           <w:lang w:eastAsia="es-ES_tradnl"/>
         </w:rPr>
+        <w:lastRenderedPageBreak/>
         <w:t xml:space="preserve">Laboratorio: </w:t>
       </w:r>
       <w:r>
@@ -2030,7 +2389,6 @@
           <w:rFonts w:ascii="Times New Roman" w:eastAsia="Times New Roman" w:hAnsi="Times New Roman" w:cs="Times New Roman"/>
           <w:lang w:eastAsia="es-ES_tradnl"/>
         </w:rPr>
-        <w:lastRenderedPageBreak/>
         <w:t>Práctica de derivación de funciones complejas que requieran la regla de la cadena.</w:t>
       </w:r>
     </w:p>
@@ -2264,6 +2622,7 @@
           <w:rFonts w:ascii="Times New Roman" w:eastAsia="Times New Roman" w:hAnsi="Times New Roman" w:cs="Times New Roman"/>
           <w:lang w:eastAsia="es-ES_tradnl"/>
         </w:rPr>
+        <w:lastRenderedPageBreak/>
         <w:t>Búsqueda de ejemplos donde estas técnicas son útiles en campos como la econometría o modelos estadísticos complejos.</w:t>
       </w:r>
     </w:p>
@@ -2650,7 +3009,6 @@
           <w:bCs/>
           <w:lang w:eastAsia="es-ES_tradnl"/>
         </w:rPr>
-        <w:lastRenderedPageBreak/>
         <w:t>Actividades de Aprendizaje en Contacto con el Docente (2h):</w:t>
       </w:r>
     </w:p>
@@ -2911,6 +3269,7 @@
           <w:rFonts w:ascii="Times New Roman" w:eastAsia="Times New Roman" w:hAnsi="Times New Roman" w:cs="Times New Roman"/>
           <w:lang w:eastAsia="es-ES_tradnl"/>
         </w:rPr>
+        <w:lastRenderedPageBreak/>
         <w:t xml:space="preserve">Resolución de </w:t>
       </w:r>
       <w:r>
@@ -3323,7 +3682,6 @@
           <w:noProof/>
           <w:lang w:eastAsia="es-ES_tradnl"/>
         </w:rPr>
-        <w:lastRenderedPageBreak/>
         <w:pict>
           <v:rect id="_x0000_i1025" alt="" style="width:441.9pt;height:.05pt;mso-width-percent:0;mso-height-percent:0;mso-width-percent:0;mso-height-percent:0" o:hralign="center" o:hrstd="t" o:hr="t" fillcolor="#a0a0a0" stroked="f"/>
         </w:pict>
@@ -3514,6 +3872,7 @@
           <w:rFonts w:ascii="Times New Roman" w:eastAsia="Times New Roman" w:hAnsi="Times New Roman" w:cs="Times New Roman"/>
           <w:lang w:eastAsia="es-ES_tradnl"/>
         </w:rPr>
+        <w:lastRenderedPageBreak/>
         <w:t>Relevancia: garantizan la existencia de puntos con ciertas propiedades de la derivada, útiles para pruebas y análisis en optimización.</w:t>
       </w:r>
     </w:p>
@@ -3994,7 +4353,6 @@
           <w:rFonts w:ascii="Times New Roman" w:eastAsia="Times New Roman" w:hAnsi="Times New Roman" w:cs="Times New Roman"/>
           <w:lang w:eastAsia="es-ES_tradnl"/>
         </w:rPr>
-        <w:lastRenderedPageBreak/>
         <w:t>Interpretación del Hessiano: curvatura del paisaje de pérdida en múltiples dimensiones, clasificación de puntos críticos.</w:t>
       </w:r>
     </w:p>
@@ -4235,6 +4593,7 @@
           <w:rFonts w:ascii="Times New Roman" w:eastAsia="Times New Roman" w:hAnsi="Times New Roman" w:cs="Times New Roman"/>
           <w:lang w:eastAsia="es-ES_tradnl"/>
         </w:rPr>
+        <w:lastRenderedPageBreak/>
         <w:t>Explicación del flujo del gradiente a través de las capas para actualizar los pesos del modelo.</w:t>
       </w:r>
     </w:p>

</xml_diff>